<commit_message>
Paso 12: Documentación actualizada con enlace a video de Youtube - 5 minutos
</commit_message>
<xml_diff>
--- a/documentacion/ProyectoFinal_Ronald_Rodriguez_Castro_C2026P1.docx
+++ b/documentacion/ProyectoFinal_Ronald_Rodriguez_Castro_C2026P1.docx
@@ -19,7 +19,7 @@
           <w:lang w:eastAsia="es-EC"/>
         </w:rPr>
         <w:drawing>
-          <wp:inline distT="0" distB="0" distL="0" distR="0" wp14:anchorId="5840D507" wp14:editId="1E5D9F5F">
+          <wp:inline distT="0" distB="0" distL="0" distR="0" wp14:anchorId="34CBA680" wp14:editId="1E5D9F5F">
             <wp:extent cx="2133600" cy="723900"/>
             <wp:effectExtent l="0" t="0" r="0" b="0"/>
             <wp:docPr id="1" name="Imagen 1" descr="Logotipo&#10;&#10;Descripción generada automáticamente con confianza media"/>
@@ -2424,7 +2424,7 @@
           <w:noProof/>
         </w:rPr>
         <w:drawing>
-          <wp:inline distT="0" distB="0" distL="0" distR="0" wp14:anchorId="4A393FD0">
+          <wp:inline distT="0" distB="0" distL="0" distR="0" wp14:anchorId="03BF4D0D">
             <wp:extent cx="3291840" cy="1625309"/>
             <wp:effectExtent l="0" t="0" r="0" b="0"/>
             <wp:docPr id="2" name="Picture 2"/>
@@ -3328,7 +3328,7 @@
           <w:noProof/>
         </w:rPr>
         <w:drawing>
-          <wp:inline distT="0" distB="0" distL="0" distR="0" wp14:anchorId="1151F957">
+          <wp:inline distT="0" distB="0" distL="0" distR="0" wp14:anchorId="5CFBA950">
             <wp:extent cx="4542168" cy="3108960"/>
             <wp:effectExtent l="0" t="0" r="0" b="0"/>
             <wp:docPr id="3" name="Picture 3"/>
@@ -3566,7 +3566,7 @@
           <w:noProof/>
         </w:rPr>
         <w:drawing>
-          <wp:inline distT="0" distB="0" distL="0" distR="0" wp14:anchorId="10D72BDE">
+          <wp:inline distT="0" distB="0" distL="0" distR="0" wp14:anchorId="3D9B47BE">
             <wp:extent cx="4754880" cy="1978030"/>
             <wp:effectExtent l="0" t="0" r="0" b="0"/>
             <wp:docPr id="4" name="Picture 4"/>
@@ -4514,7 +4514,7 @@
           <w:noProof/>
         </w:rPr>
         <w:drawing>
-          <wp:inline distT="0" distB="0" distL="0" distR="0" wp14:anchorId="29BA8C09">
+          <wp:inline distT="0" distB="0" distL="0" distR="0" wp14:anchorId="091C0A29">
             <wp:extent cx="4023360" cy="2556510"/>
             <wp:effectExtent l="0" t="0" r="0" b="0"/>
             <wp:docPr id="5" name="Picture 5"/>
@@ -4593,7 +4593,7 @@
           <w:noProof/>
         </w:rPr>
         <w:drawing>
-          <wp:inline distT="0" distB="0" distL="0" distR="0" wp14:anchorId="749B0B6F">
+          <wp:inline distT="0" distB="0" distL="0" distR="0" wp14:anchorId="13BE7AF9">
             <wp:extent cx="5486400" cy="2049417"/>
             <wp:effectExtent l="0" t="0" r="0" b="0"/>
             <wp:docPr id="6" name="Picture 6"/>
@@ -4673,7 +4673,7 @@
           <w:noProof/>
         </w:rPr>
         <w:drawing>
-          <wp:inline distT="0" distB="0" distL="0" distR="0" wp14:anchorId="7B129D2D">
+          <wp:inline distT="0" distB="0" distL="0" distR="0" wp14:anchorId="0D805F27">
             <wp:extent cx="5486400" cy="3229301"/>
             <wp:effectExtent l="0" t="0" r="0" b="0"/>
             <wp:docPr id="7" name="Picture 7"/>
@@ -4761,26 +4761,61 @@
     </w:p>
     <w:p>
       <w:r>
-        <w:t xml:space="preserve">Video de demostración (máximo 5 minutos), alojado en Google Drive: </w:t>
-      </w:r>
-      <w:hyperlink r:id="rId16">
+        <w:t xml:space="preserve">Video de demostración (máximo 5 minutos), alojado en </w:t>
+      </w:r>
+    </w:p>
+    <w:p>
+      <w:proofErr w:type="spellStart"/>
+      <w:r>
+        <w:t>Youtube</w:t>
+      </w:r>
+      <w:proofErr w:type="spellEnd"/>
+      <w:r>
+        <w:t xml:space="preserve">: </w:t>
+      </w:r>
+      <w:hyperlink r:id="rId16" w:history="1">
+        <w:r>
+          <w:rPr>
+            <w:rStyle w:val="Hipervnculo"/>
+          </w:rPr>
+          <w:t>https://youtu.be/xU3VRjwYBis</w:t>
+        </w:r>
+      </w:hyperlink>
+    </w:p>
+    <w:p>
+      <w:pPr>
+        <w:rPr>
+          <w:lang w:val="en-US"/>
+        </w:rPr>
+      </w:pPr>
+      <w:r>
+        <w:rPr>
+          <w:lang w:val="en-US"/>
+        </w:rPr>
+        <w:t xml:space="preserve">Google Drive: </w:t>
+      </w:r>
+      <w:hyperlink r:id="rId17">
         <w:r>
           <w:rPr>
             <w:color w:val="0563C1"/>
             <w:u w:val="single"/>
+            <w:lang w:val="en-US"/>
           </w:rPr>
           <w:t>https://drive.google.com/file/d/19-RqUtLmYa16o6PIX5KyII_PZxUpP-he/view?usp=drive_link</w:t>
         </w:r>
       </w:hyperlink>
     </w:p>
     <w:p>
+      <w:pPr>
+        <w:jc w:val="both"/>
+      </w:pPr>
       <w:r>
         <w:t>El video muestra el inicio de la aplicación, la carga del dataset, el análisis y las visualizaciones, las funciones relevantes, la interacción con el agente, la conexión con Ollama y la interpretación de una respuesta.</w:t>
       </w:r>
     </w:p>
     <w:sectPr>
-      <w:headerReference w:type="default" r:id="rId17"/>
-      <w:footerReference w:type="default" r:id="rId18"/>
+      <w:headerReference w:type="default" r:id="rId18"/>
+      <w:footerReference w:type="default" r:id="rId19"/>
       <w:pgSz w:w="11906" w:h="16838"/>
       <w:pgMar w:top="1440" w:right="1440" w:bottom="1440" w:left="1440" w:header="708" w:footer="363" w:gutter="0"/>
       <w:pgNumType w:start="0"/>
@@ -4985,7 +5020,7 @@
       <mc:AlternateContent>
         <mc:Choice Requires="wpg">
           <w:drawing>
-            <wp:anchor distT="0" distB="0" distL="114300" distR="114300" simplePos="0" relativeHeight="251659264" behindDoc="0" locked="0" layoutInCell="1" allowOverlap="1" wp14:anchorId="31AE405F" wp14:editId="7409B960">
+            <wp:anchor distT="0" distB="0" distL="114300" distR="114300" simplePos="0" relativeHeight="251659264" behindDoc="0" locked="0" layoutInCell="1" allowOverlap="1" wp14:anchorId="73E6130A" wp14:editId="7409B960">
               <wp:simplePos x="0" y="0"/>
               <wp:positionH relativeFrom="column">
                 <wp:posOffset>4620895</wp:posOffset>
@@ -9934,6 +9969,7 @@
     <w:rsid w:val="008166D8"/>
     <w:rsid w:val="009962CD"/>
     <w:rsid w:val="009F4FCD"/>
+    <w:rsid w:val="00A94CA1"/>
     <w:rsid w:val="00B20DC8"/>
     <w:rsid w:val="00B45B8E"/>
     <w:rsid w:val="00B83A9F"/>

</xml_diff>